<commit_message>
Finished UD 3 presentation
</commit_message>
<xml_diff>
--- a/UD1 Sostenibilidad y desarrollo responsable en el entorno productivo/For exam.docx
+++ b/UD1 Sostenibilidad y desarrollo responsable en el entorno productivo/For exam.docx
@@ -5,16 +5,27 @@
     <w:p>
       <w:pPr>
         <w:jc w:val="center"/>
+        <w:rPr>
+          <w:noProof/>
+        </w:rPr>
       </w:pPr>
-      <w:r>
+    </w:p>
+    <w:p>
+      <w:pPr>
+        <w:jc w:val="center"/>
         <w:rPr>
           <w:noProof/>
         </w:rPr>
+      </w:pPr>
+      <w:r>
+        <w:rPr>
+          <w:noProof/>
+        </w:rPr>
         <w:drawing>
-          <wp:inline distT="0" distB="0" distL="0" distR="0" wp14:anchorId="09BDCBF8" wp14:editId="05467013">
-            <wp:extent cx="6810166" cy="10026594"/>
-            <wp:effectExtent l="0" t="0" r="0" b="0"/>
-            <wp:docPr id="2" name="Imagen 2"/>
+          <wp:inline distT="0" distB="0" distL="0" distR="0" wp14:anchorId="52FF6B1A" wp14:editId="0E97F24A">
+            <wp:extent cx="9576580" cy="6418234"/>
+            <wp:effectExtent l="0" t="1905" r="3810" b="3810"/>
+            <wp:docPr id="1" name="Imagen 1"/>
             <wp:cNvGraphicFramePr>
               <a:graphicFrameLocks xmlns:a="http://schemas.openxmlformats.org/drawingml/2006/main" noChangeAspect="1"/>
             </wp:cNvGraphicFramePr>
@@ -41,17 +52,14 @@
                     </a:stretch>
                   </pic:blipFill>
                   <pic:spPr bwMode="auto">
-                    <a:xfrm>
+                    <a:xfrm rot="5400000">
                       <a:off x="0" y="0"/>
-                      <a:ext cx="6841475" cy="10072690"/>
+                      <a:ext cx="9624566" cy="6450394"/>
                     </a:xfrm>
                     <a:prstGeom prst="rect">
                       <a:avLst/>
                     </a:prstGeom>
                     <a:noFill/>
-                    <a:ln>
-                      <a:noFill/>
-                    </a:ln>
                   </pic:spPr>
                 </pic:pic>
               </a:graphicData>
@@ -59,6 +67,17 @@
           </wp:inline>
         </w:drawing>
       </w:r>
+      <w:r>
+        <w:rPr>
+          <w:noProof/>
+        </w:rPr>
+        <w:br w:type="page"/>
+      </w:r>
+    </w:p>
+    <w:p>
+      <w:pPr>
+        <w:jc w:val="center"/>
+      </w:pPr>
     </w:p>
     <w:p>
       <w:pPr>
@@ -80,7 +99,6 @@
           <w:sz w:val="26"/>
           <w:szCs w:val="28"/>
         </w:rPr>
-        <w:lastRenderedPageBreak/>
         <w:t>ISO 26000</w:t>
       </w:r>
       <w:r>
@@ -142,30 +160,14 @@
           <w:sz w:val="26"/>
           <w:szCs w:val="28"/>
         </w:rPr>
-        <w:t>I</w:t>
-      </w:r>
-      <w:r>
-        <w:rPr>
-          <w:b/>
-          <w:bCs/>
-          <w:sz w:val="26"/>
-          <w:szCs w:val="28"/>
-        </w:rPr>
-        <w:t>SO 14001</w:t>
-      </w:r>
-      <w:r>
-        <w:rPr>
-          <w:sz w:val="26"/>
-          <w:szCs w:val="28"/>
-        </w:rPr>
-        <w:t xml:space="preserve"> </w:t>
-      </w:r>
-      <w:r>
-        <w:rPr>
-          <w:sz w:val="26"/>
-          <w:szCs w:val="28"/>
-        </w:rPr>
-        <w:t>consiste en implementar un Sistema de Gesti</w:t>
+        <w:t>ISO 14001</w:t>
+      </w:r>
+      <w:r>
+        <w:rPr>
+          <w:sz w:val="26"/>
+          <w:szCs w:val="28"/>
+        </w:rPr>
+        <w:t xml:space="preserve"> consiste en implementar un Sistema de Gesti</w:t>
       </w:r>
       <w:r>
         <w:rPr>
@@ -477,14 +479,7 @@
           <w:sz w:val="26"/>
           <w:szCs w:val="28"/>
         </w:rPr>
-        <w:t xml:space="preserve"> de efecto (GEI) invernadero que causan el calentamiento global</w:t>
-      </w:r>
-      <w:r>
-        <w:rPr>
-          <w:sz w:val="26"/>
-          <w:szCs w:val="28"/>
-        </w:rPr>
-        <w:t xml:space="preserve"> </w:t>
+        <w:t xml:space="preserve"> de efecto (GEI) invernadero que causan el calentamiento global </w:t>
       </w:r>
       <w:r>
         <w:rPr>
@@ -549,14 +544,7 @@
           <w:sz w:val="26"/>
           <w:szCs w:val="28"/>
         </w:rPr>
-        <w:t xml:space="preserve"> </w:t>
-      </w:r>
-      <w:r>
-        <w:rPr>
-          <w:sz w:val="26"/>
-          <w:szCs w:val="28"/>
-        </w:rPr>
-        <w:t xml:space="preserve">trata temas relacionados con el </w:t>
+        <w:t xml:space="preserve"> trata temas relacionados con el </w:t>
       </w:r>
       <w:r>
         <w:rPr>
@@ -615,16 +603,7 @@
           <w:sz w:val="26"/>
           <w:szCs w:val="28"/>
         </w:rPr>
-        <w:t>tico</w:t>
-      </w:r>
-      <w:r>
-        <w:rPr>
-          <w:b/>
-          <w:bCs/>
-          <w:sz w:val="26"/>
-          <w:szCs w:val="28"/>
-        </w:rPr>
-        <w:t xml:space="preserve"> (1992)</w:t>
+        <w:t>tico (1992)</w:t>
       </w:r>
       <w:r>
         <w:rPr>
@@ -734,32 +713,16 @@
           <w:sz w:val="26"/>
           <w:szCs w:val="28"/>
         </w:rPr>
-        <w:t xml:space="preserve"> de la Tierra a</w:t>
-      </w:r>
-      <w:r>
-        <w:rPr>
-          <w:sz w:val="26"/>
-          <w:szCs w:val="28"/>
-        </w:rPr>
-        <w:t xml:space="preserve"> </w:t>
-      </w:r>
-      <w:r>
-        <w:rPr>
-          <w:b/>
-          <w:bCs/>
-          <w:sz w:val="26"/>
-          <w:szCs w:val="28"/>
-        </w:rPr>
-        <w:t>m</w:t>
-      </w:r>
-      <w:r>
-        <w:rPr>
-          <w:b/>
-          <w:bCs/>
-          <w:sz w:val="26"/>
-          <w:szCs w:val="28"/>
-        </w:rPr>
-        <w:t>enos de 2</w:t>
+        <w:t xml:space="preserve"> de la Tierra a </w:t>
+      </w:r>
+      <w:r>
+        <w:rPr>
+          <w:b/>
+          <w:bCs/>
+          <w:sz w:val="26"/>
+          <w:szCs w:val="28"/>
+        </w:rPr>
+        <w:t>menos de 2</w:t>
       </w:r>
       <w:r>
         <w:rPr>
@@ -974,16 +937,7 @@
           <w:sz w:val="26"/>
           <w:szCs w:val="28"/>
         </w:rPr>
-        <w:t>futuras</w:t>
-      </w:r>
-      <w:r>
-        <w:rPr>
-          <w:b/>
-          <w:bCs/>
-          <w:sz w:val="26"/>
-          <w:szCs w:val="28"/>
-        </w:rPr>
-        <w:t xml:space="preserve"> (1987)</w:t>
+        <w:t>futuras (1987)</w:t>
       </w:r>
       <w:r>
         <w:rPr>
@@ -1020,14 +974,7 @@
           <w:sz w:val="26"/>
           <w:szCs w:val="28"/>
         </w:rPr>
-        <w:t xml:space="preserve"> e</w:t>
-      </w:r>
-      <w:r>
-        <w:rPr>
-          <w:sz w:val="26"/>
-          <w:szCs w:val="28"/>
-        </w:rPr>
-        <w:t xml:space="preserve">xige el </w:t>
+        <w:t xml:space="preserve"> exige el </w:t>
       </w:r>
       <w:r>
         <w:rPr>
@@ -1109,14 +1056,7 @@
           <w:sz w:val="26"/>
           <w:szCs w:val="28"/>
         </w:rPr>
-        <w:t>as</w:t>
-      </w:r>
-      <w:r>
-        <w:rPr>
-          <w:sz w:val="26"/>
-          <w:szCs w:val="28"/>
-        </w:rPr>
-        <w:t xml:space="preserve"> </w:t>
+        <w:t xml:space="preserve">as </w:t>
       </w:r>
       <w:r>
         <w:rPr>
@@ -1162,14 +1102,7 @@
           <w:sz w:val="26"/>
           <w:szCs w:val="28"/>
         </w:rPr>
-        <w:t xml:space="preserve"> e</w:t>
-      </w:r>
-      <w:r>
-        <w:rPr>
-          <w:sz w:val="26"/>
-          <w:szCs w:val="28"/>
-        </w:rPr>
-        <w:t>stablece un fuerte r</w:t>
+        <w:t xml:space="preserve"> establece un fuerte r</w:t>
       </w:r>
       <w:r>
         <w:rPr>
@@ -1475,14 +1408,7 @@
           <w:sz w:val="26"/>
           <w:szCs w:val="28"/>
         </w:rPr>
-        <w:t xml:space="preserve"> en </w:t>
-      </w:r>
-      <w:r>
-        <w:rPr>
-          <w:sz w:val="26"/>
-          <w:szCs w:val="28"/>
-        </w:rPr>
-        <w:t>(</w:t>
+        <w:t xml:space="preserve"> en (</w:t>
       </w:r>
       <w:r>
         <w:rPr>
@@ -2022,16 +1948,7 @@
           <w:sz w:val="26"/>
           <w:szCs w:val="28"/>
         </w:rPr>
-        <w:t>IBEX ESG</w:t>
-      </w:r>
-      <w:r>
-        <w:rPr>
-          <w:b/>
-          <w:bCs/>
-          <w:sz w:val="26"/>
-          <w:szCs w:val="28"/>
-        </w:rPr>
-        <w:t xml:space="preserve"> </w:t>
+        <w:t xml:space="preserve">IBEX ESG </w:t>
       </w:r>
       <w:r>
         <w:rPr>
@@ -2297,14 +2214,7 @@
           <w:sz w:val="26"/>
           <w:szCs w:val="28"/>
         </w:rPr>
-        <w:t xml:space="preserve"> e</w:t>
-      </w:r>
-      <w:r>
-        <w:rPr>
-          <w:sz w:val="26"/>
-          <w:szCs w:val="28"/>
-        </w:rPr>
-        <w:t xml:space="preserve">s un </w:t>
+        <w:t xml:space="preserve"> es un </w:t>
       </w:r>
       <w:r>
         <w:rPr>
@@ -2351,32 +2261,16 @@
           <w:sz w:val="26"/>
           <w:szCs w:val="28"/>
         </w:rPr>
-        <w:t xml:space="preserve"> a</w:t>
-      </w:r>
-      <w:r>
-        <w:rPr>
-          <w:sz w:val="26"/>
-          <w:szCs w:val="28"/>
-        </w:rPr>
-        <w:t xml:space="preserve"> </w:t>
-      </w:r>
-      <w:r>
-        <w:rPr>
-          <w:b/>
-          <w:bCs/>
-          <w:sz w:val="26"/>
-          <w:szCs w:val="28"/>
-        </w:rPr>
-        <w:t>p</w:t>
-      </w:r>
-      <w:r>
-        <w:rPr>
-          <w:b/>
-          <w:bCs/>
-          <w:sz w:val="26"/>
-          <w:szCs w:val="28"/>
-        </w:rPr>
-        <w:t>a</w:t>
+        <w:t xml:space="preserve"> a </w:t>
+      </w:r>
+      <w:r>
+        <w:rPr>
+          <w:b/>
+          <w:bCs/>
+          <w:sz w:val="26"/>
+          <w:szCs w:val="28"/>
+        </w:rPr>
+        <w:t>pa</w:t>
       </w:r>
       <w:r>
         <w:rPr>
@@ -2395,16 +2289,7 @@
           <w:sz w:val="26"/>
           <w:szCs w:val="28"/>
         </w:rPr>
-        <w:t>ses en desarrollo</w:t>
-      </w:r>
-      <w:r>
-        <w:rPr>
-          <w:b/>
-          <w:bCs/>
-          <w:sz w:val="26"/>
-          <w:szCs w:val="28"/>
-        </w:rPr>
-        <w:t>.</w:t>
+        <w:t>ses en desarrollo.</w:t>
       </w:r>
     </w:p>
     <w:p>
@@ -2453,21 +2338,7 @@
           <w:sz w:val="26"/>
           <w:szCs w:val="28"/>
         </w:rPr>
-        <w:t xml:space="preserve"> tiene como objetivo principal</w:t>
-      </w:r>
-      <w:r>
-        <w:rPr>
-          <w:sz w:val="26"/>
-          <w:szCs w:val="28"/>
-        </w:rPr>
-        <w:t xml:space="preserve"> a</w:t>
-      </w:r>
-      <w:r>
-        <w:rPr>
-          <w:sz w:val="26"/>
-          <w:szCs w:val="28"/>
-        </w:rPr>
-        <w:t xml:space="preserve">poyar a las </w:t>
+        <w:t xml:space="preserve"> tiene como objetivo principal apoyar a las </w:t>
       </w:r>
       <w:r>
         <w:rPr>
@@ -2593,16 +2464,7 @@
           <w:sz w:val="26"/>
           <w:szCs w:val="28"/>
         </w:rPr>
-        <w:t>tica</w:t>
-      </w:r>
-      <w:r>
-        <w:rPr>
-          <w:b/>
-          <w:bCs/>
-          <w:sz w:val="26"/>
-          <w:szCs w:val="28"/>
-        </w:rPr>
-        <w:t>.</w:t>
+        <w:t>tica.</w:t>
       </w:r>
     </w:p>
     <w:p>
@@ -2632,14 +2494,7 @@
           <w:sz w:val="26"/>
           <w:szCs w:val="28"/>
         </w:rPr>
-        <w:t xml:space="preserve"> refiere </w:t>
-      </w:r>
-      <w:r>
-        <w:rPr>
-          <w:sz w:val="26"/>
-          <w:szCs w:val="28"/>
-        </w:rPr>
-        <w:t xml:space="preserve">al promedio de las </w:t>
+        <w:t xml:space="preserve"> refiere al promedio de las </w:t>
       </w:r>
       <w:r>
         <w:rPr>
@@ -2800,14 +2655,7 @@
           <w:sz w:val="26"/>
           <w:szCs w:val="28"/>
         </w:rPr>
-        <w:t xml:space="preserve"> </w:t>
-      </w:r>
-      <w:r>
-        <w:rPr>
-          <w:sz w:val="26"/>
-          <w:szCs w:val="28"/>
-        </w:rPr>
-        <w:t xml:space="preserve">del </w:t>
+        <w:t xml:space="preserve"> del </w:t>
       </w:r>
       <w:r>
         <w:rPr>
@@ -2832,16 +2680,7 @@
           <w:sz w:val="26"/>
           <w:szCs w:val="28"/>
         </w:rPr>
-        <w:t>Ayuda Oficial al Desarrollo</w:t>
-      </w:r>
-      <w:r>
-        <w:rPr>
-          <w:b/>
-          <w:bCs/>
-          <w:sz w:val="26"/>
-          <w:szCs w:val="28"/>
-        </w:rPr>
-        <w:t>.</w:t>
+        <w:t>Ayuda Oficial al Desarrollo.</w:t>
       </w:r>
     </w:p>
     <w:p>
@@ -2862,14 +2701,7 @@
           <w:sz w:val="26"/>
           <w:szCs w:val="28"/>
         </w:rPr>
-        <w:t>E</w:t>
-      </w:r>
-      <w:r>
-        <w:rPr>
-          <w:sz w:val="26"/>
-          <w:szCs w:val="28"/>
-        </w:rPr>
-        <w:t>l total de desaf</w:t>
+        <w:t>El total de desaf</w:t>
       </w:r>
       <w:r>
         <w:rPr>
@@ -2900,14 +2732,7 @@
           <w:sz w:val="26"/>
           <w:szCs w:val="28"/>
         </w:rPr>
-        <w:t xml:space="preserve"> es</w:t>
-      </w:r>
-      <w:r>
-        <w:rPr>
-          <w:sz w:val="26"/>
-          <w:szCs w:val="28"/>
-        </w:rPr>
-        <w:t xml:space="preserve"> </w:t>
+        <w:t xml:space="preserve"> es </w:t>
       </w:r>
       <w:r>
         <w:rPr>
@@ -3454,6 +3279,7 @@
   <w:style w:type="character" w:default="1" w:styleId="Fuentedeprrafopredeter">
     <w:name w:val="Default Paragraph Font"/>
     <w:uiPriority w:val="1"/>
+    <w:semiHidden/>
     <w:unhideWhenUsed/>
   </w:style>
   <w:style w:type="table" w:default="1" w:styleId="Tablanormal">

</xml_diff>